<commit_message>
kontrol listesi eklendi, sprint5 başlandı
</commit_message>
<xml_diff>
--- a/Docs/25-11-2025-Sprint4/IEEE_STP v1.0.docx
+++ b/Docs/25-11-2025-Sprint4/IEEE_STP v1.0.docx
@@ -447,7 +447,7 @@
                 <w:szCs w:val="24"/>
                 <w:rtl w:val="0"/>
               </w:rPr>
-              <w:t xml:space="preserve">(To be assigned)</w:t>
+              <w:t xml:space="preserve">STP-01-PAPILLON</w:t>
             </w:r>
           </w:p>
         </w:tc>
@@ -495,7 +495,7 @@
                 <w:szCs w:val="24"/>
                 <w:rtl w:val="0"/>
               </w:rPr>
-              <w:t xml:space="preserve">STP-01-PAPILLON</w:t>
+              <w:t xml:space="preserve">Kerem ELMA</w:t>
             </w:r>
           </w:p>
         </w:tc>
@@ -582,12 +582,8 @@
             </w:pPr>
             <w:r>
               <w:rPr>
-                <w:rFonts w:ascii="Times New Roman" w:cs="Times New Roman" w:eastAsia="Times New Roman" w:hAnsi="Times New Roman"/>
-                <w:sz w:val="24"/>
-                <w:szCs w:val="24"/>
                 <w:rtl w:val="0"/>
               </w:rPr>
-              <w:t xml:space="preserve">Kerem ELMA</w:t>
             </w:r>
           </w:p>
         </w:tc>
@@ -1336,7 +1332,7 @@
     </w:p>
     <w:sdt>
       <w:sdtPr>
-        <w:id w:val="2125687429"/>
+        <w:id w:val="-150346640"/>
         <w:docPartObj>
           <w:docPartGallery w:val="Table of Contents"/>
           <w:docPartUnique w:val="1"/>
@@ -3608,7 +3604,7 @@
       </w:pPr>
       <w:sdt>
         <w:sdtPr>
-          <w:id w:val="444092623"/>
+          <w:id w:val="130487755"/>
           <w:tag w:val="goog_rdk_0"/>
         </w:sdtPr>
         <w:sdtContent>
@@ -3641,7 +3637,7 @@
       </w:pPr>
       <w:sdt>
         <w:sdtPr>
-          <w:id w:val="-730376928"/>
+          <w:id w:val="138475647"/>
           <w:tag w:val="goog_rdk_1"/>
         </w:sdtPr>
         <w:sdtContent>

</xml_diff>